<commit_message>
Add cable requirements to contractor handoff
</commit_message>
<xml_diff>
--- a/exports/装修队强弱电必要确认_2026-07-07.docx
+++ b/exports/装修队强弱电必要确认_2026-07-07.docx
@@ -128,7 +128,7 @@
         <w:rPr>
           <w:rFonts w:ascii="PingFang SC" w:hAnsi="PingFang SC" w:eastAsia="PingFang SC"/>
           <w:b w:val="0"/>
-          <w:sz w:val="20"/>
+          <w:sz w:val="19"/>
         </w:rPr>
         <w:t>M1 衣帽间机柜：强电插座 + 弱电汇聚。</w:t>
       </w:r>
@@ -142,7 +142,7 @@
         <w:rPr>
           <w:rFonts w:ascii="PingFang SC" w:hAnsi="PingFang SC" w:eastAsia="PingFang SC"/>
           <w:b w:val="0"/>
-          <w:sz w:val="20"/>
+          <w:sz w:val="19"/>
         </w:rPr>
         <w:t>M2 P2S：独立插座；不接 UPS；不留墙面网口。</w:t>
       </w:r>
@@ -156,7 +156,7 @@
         <w:rPr>
           <w:rFonts w:ascii="PingFang SC" w:hAnsi="PingFang SC" w:eastAsia="PingFang SC"/>
           <w:b w:val="0"/>
-          <w:sz w:val="20"/>
+          <w:sz w:val="19"/>
         </w:rPr>
         <w:t>M3 AP1/AP2：各 1 根 PoE 网线回衣帽间。</w:t>
       </w:r>
@@ -170,7 +170,7 @@
         <w:rPr>
           <w:rFonts w:ascii="PingFang SC" w:hAnsi="PingFang SC" w:eastAsia="PingFang SC"/>
           <w:b w:val="0"/>
-          <w:sz w:val="20"/>
+          <w:sz w:val="19"/>
         </w:rPr>
         <w:t>M4 PoE Zigbee：中央高位 1 根网线。</w:t>
       </w:r>
@@ -184,7 +184,7 @@
         <w:rPr>
           <w:rFonts w:ascii="PingFang SC" w:hAnsi="PingFang SC" w:eastAsia="PingFang SC"/>
           <w:b w:val="0"/>
-          <w:sz w:val="20"/>
+          <w:sz w:val="19"/>
         </w:rPr>
         <w:t>M5 书房桌位：2 网口 + 大容量插座。</w:t>
       </w:r>
@@ -198,7 +198,7 @@
         <w:rPr>
           <w:rFonts w:ascii="PingFang SC" w:hAnsi="PingFang SC" w:eastAsia="PingFang SC"/>
           <w:b w:val="0"/>
-          <w:sz w:val="20"/>
+          <w:sz w:val="19"/>
         </w:rPr>
         <w:t>M6 次卧/儿童房：2 网口 + 插座。</w:t>
       </w:r>
@@ -212,7 +212,7 @@
         <w:rPr>
           <w:rFonts w:ascii="PingFang SC" w:hAnsi="PingFang SC" w:eastAsia="PingFang SC"/>
           <w:b w:val="0"/>
-          <w:sz w:val="20"/>
+          <w:sz w:val="19"/>
         </w:rPr>
         <w:t>M7 主卧阳台：至少 1 网口 + 插座。</w:t>
       </w:r>
@@ -226,7 +226,7 @@
         <w:rPr>
           <w:rFonts w:ascii="PingFang SC" w:hAnsi="PingFang SC" w:eastAsia="PingFang SC"/>
           <w:b w:val="0"/>
-          <w:sz w:val="20"/>
+          <w:sz w:val="19"/>
         </w:rPr>
         <w:t>M8 影音柜：1 网口 + 多位插座。</w:t>
       </w:r>
@@ -240,7 +240,7 @@
         <w:rPr>
           <w:rFonts w:ascii="PingFang SC" w:hAnsi="PingFang SC" w:eastAsia="PingFang SC"/>
           <w:b w:val="0"/>
-          <w:sz w:val="20"/>
+          <w:sz w:val="19"/>
         </w:rPr>
         <w:t>M9 短焦投影/幕布：不留顶面投影电源；影音柜和幕布盒预留电源/管线。</w:t>
       </w:r>
@@ -254,7 +254,7 @@
         <w:rPr>
           <w:rFonts w:ascii="PingFang SC" w:hAnsi="PingFang SC" w:eastAsia="PingFang SC"/>
           <w:b w:val="0"/>
-          <w:sz w:val="20"/>
+          <w:sz w:val="19"/>
         </w:rPr>
         <w:t>M10 RS-485：从衣帽间机柜预留到空调/加湿接入点；图中仅示意两端，不代表实际走线。</w:t>
       </w:r>
@@ -268,7 +268,7 @@
         <w:rPr>
           <w:rFonts w:ascii="PingFang SC" w:hAnsi="PingFang SC" w:eastAsia="PingFang SC"/>
           <w:b w:val="0"/>
-          <w:sz w:val="20"/>
+          <w:sz w:val="19"/>
         </w:rPr>
         <w:t>M11A/M11B：次卫洗衣 + 厨下/总水阀，水电可检修。</w:t>
       </w:r>
@@ -282,9 +282,107 @@
         <w:rPr>
           <w:rFonts w:ascii="PingFang SC" w:hAnsi="PingFang SC" w:eastAsia="PingFang SC"/>
           <w:b w:val="0"/>
-          <w:sz w:val="20"/>
+          <w:sz w:val="19"/>
         </w:rPr>
         <w:t>M12 窗帘盒：每组电机侧 220V 常电。</w:t>
+      </w:r>
+    </w:p>
+    <w:p>
+      <w:pPr>
+        <w:pStyle w:val="Heading2"/>
+      </w:pPr>
+      <w:r>
+        <w:rPr>
+          <w:rFonts w:ascii="PingFang SC" w:hAnsi="PingFang SC" w:eastAsia="PingFang SC"/>
+          <w:b/>
+          <w:color w:val="1F4F78"/>
+          <w:sz w:val="25"/>
+        </w:rPr>
+        <w:t>线材和管线要求</w:t>
+      </w:r>
+    </w:p>
+    <w:p>
+      <w:pPr>
+        <w:pStyle w:val="ListBullet"/>
+        <w:spacing w:after="40"/>
+      </w:pPr>
+      <w:r>
+        <w:rPr>
+          <w:rFonts w:ascii="PingFang SC" w:hAnsi="PingFang SC" w:eastAsia="PingFang SC"/>
+          <w:b w:val="0"/>
+          <w:sz w:val="19"/>
+        </w:rPr>
+        <w:t>新增网络点、AP、PoE Zigbee、影音柜、书房、次卧/儿童房、主卧阳台：统一用 Cat6A 网线，不要求七类线。</w:t>
+      </w:r>
+    </w:p>
+    <w:p>
+      <w:pPr>
+        <w:pStyle w:val="ListBullet"/>
+        <w:spacing w:after="40"/>
+      </w:pPr>
+      <w:r>
+        <w:rPr>
+          <w:rFonts w:ascii="PingFang SC" w:hAnsi="PingFang SC" w:eastAsia="PingFang SC"/>
+          <w:b w:val="0"/>
+          <w:sz w:val="19"/>
+        </w:rPr>
+        <w:t>AP1/AP2、PoE Zigbee：每个点 1 根 Cat6A 直回衣帽间机柜/交换机侧，中途不要接驳。</w:t>
+      </w:r>
+    </w:p>
+    <w:p>
+      <w:pPr>
+        <w:pStyle w:val="ListBullet"/>
+        <w:spacing w:after="40"/>
+      </w:pPr>
+      <w:r>
+        <w:rPr>
+          <w:rFonts w:ascii="PingFang SC" w:hAnsi="PingFang SC" w:eastAsia="PingFang SC"/>
+          <w:b w:val="0"/>
+          <w:sz w:val="19"/>
+        </w:rPr>
+        <w:t>RS-485：日立空调、中央加湿各自独立管线回衣帽间；可用 Cat6A 或屏蔽双绞线作为 485 线，A/B 使用同一对双绞线。</w:t>
+      </w:r>
+    </w:p>
+    <w:p>
+      <w:pPr>
+        <w:pStyle w:val="ListBullet"/>
+        <w:spacing w:after="40"/>
+      </w:pPr>
+      <w:r>
+        <w:rPr>
+          <w:rFonts w:ascii="PingFang SC" w:hAnsi="PingFang SC" w:eastAsia="PingFang SC"/>
+          <w:b w:val="0"/>
+          <w:sz w:val="19"/>
+        </w:rPr>
+        <w:t>强电 220V 与网线/RS-485 必须分管分槽；如需交叉，尽量 90 度交叉。</w:t>
+      </w:r>
+    </w:p>
+    <w:p>
+      <w:pPr>
+        <w:pStyle w:val="ListBullet"/>
+        <w:spacing w:after="40"/>
+      </w:pPr>
+      <w:r>
+        <w:rPr>
+          <w:rFonts w:ascii="PingFang SC" w:hAnsi="PingFang SC" w:eastAsia="PingFang SC"/>
+          <w:b w:val="0"/>
+          <w:sz w:val="19"/>
+        </w:rPr>
+        <w:t>所有暗管预留穿线绳；线缆两端贴标签；封槽、封吊顶、封柜前拍照留档。</w:t>
+      </w:r>
+    </w:p>
+    <w:p>
+      <w:pPr>
+        <w:pStyle w:val="ListBullet"/>
+        <w:spacing w:after="40"/>
+      </w:pPr>
+      <w:r>
+        <w:rPr>
+          <w:rFonts w:ascii="PingFang SC" w:hAnsi="PingFang SC" w:eastAsia="PingFang SC"/>
+          <w:b w:val="0"/>
+          <w:sz w:val="19"/>
+        </w:rPr>
+        <w:t>管径和弯头要保证后续可抽换，重点是 AP、PoE Zigbee、影音柜和衣帽间机柜回线。</w:t>
       </w:r>
     </w:p>
     <w:p>
@@ -304,13 +402,13 @@
     <w:p>
       <w:pPr>
         <w:pStyle w:val="ListBullet"/>
-        <w:spacing w:after="60"/>
+        <w:spacing w:after="40"/>
       </w:pPr>
       <w:r>
         <w:rPr>
           <w:rFonts w:ascii="PingFang SC" w:hAnsi="PingFang SC" w:eastAsia="PingFang SC"/>
           <w:b w:val="0"/>
-          <w:sz w:val="21"/>
+          <w:sz w:val="19"/>
         </w:rPr>
         <w:t>入户高位摄像头 / 低位门铃。</w:t>
       </w:r>
@@ -318,13 +416,13 @@
     <w:p>
       <w:pPr>
         <w:pStyle w:val="ListBullet"/>
-        <w:spacing w:after="60"/>
+        <w:spacing w:after="40"/>
       </w:pPr>
       <w:r>
         <w:rPr>
           <w:rFonts w:ascii="PingFang SC" w:hAnsi="PingFang SC" w:eastAsia="PingFang SC"/>
           <w:b w:val="0"/>
-          <w:sz w:val="21"/>
+          <w:sz w:val="19"/>
         </w:rPr>
         <w:t>P2S 墙面网口。</w:t>
       </w:r>
@@ -332,13 +430,13 @@
     <w:p>
       <w:pPr>
         <w:pStyle w:val="ListBullet"/>
-        <w:spacing w:after="60"/>
+        <w:spacing w:after="40"/>
       </w:pPr>
       <w:r>
         <w:rPr>
           <w:rFonts w:ascii="PingFang SC" w:hAnsi="PingFang SC" w:eastAsia="PingFang SC"/>
           <w:b w:val="0"/>
-          <w:sz w:val="21"/>
+          <w:sz w:val="19"/>
         </w:rPr>
         <w:t>AP-R / 第 3 个 AP。</w:t>
       </w:r>
@@ -346,13 +444,13 @@
     <w:p>
       <w:pPr>
         <w:pStyle w:val="ListBullet"/>
-        <w:spacing w:after="60"/>
+        <w:spacing w:after="40"/>
       </w:pPr>
       <w:r>
         <w:rPr>
           <w:rFonts w:ascii="PingFang SC" w:hAnsi="PingFang SC" w:eastAsia="PingFang SC"/>
           <w:b w:val="0"/>
-          <w:sz w:val="21"/>
+          <w:sz w:val="19"/>
         </w:rPr>
         <w:t>CO2、门磁、水浸等电池传感器逐点拉线。</w:t>
       </w:r>
@@ -360,27 +458,32 @@
     <w:p>
       <w:pPr>
         <w:pStyle w:val="ListBullet"/>
-        <w:spacing w:after="60"/>
+        <w:spacing w:after="40"/>
       </w:pPr>
       <w:r>
         <w:rPr>
           <w:rFonts w:ascii="PingFang SC" w:hAnsi="PingFang SC" w:eastAsia="PingFang SC"/>
           <w:b w:val="0"/>
-          <w:sz w:val="21"/>
+          <w:sz w:val="19"/>
         </w:rPr>
         <w:t>短焦投影仪顶面吊装电源。</w:t>
       </w:r>
     </w:p>
     <w:p>
+      <w:r>
+        <w:br w:type="page"/>
+      </w:r>
+    </w:p>
+    <w:p>
       <w:pPr>
-        <w:pStyle w:val="Heading2"/>
+        <w:pStyle w:val="Heading1"/>
       </w:pPr>
       <w:r>
         <w:rPr>
           <w:rFonts w:ascii="PingFang SC" w:hAnsi="PingFang SC" w:eastAsia="PingFang SC"/>
           <w:b/>
           <w:color w:val="1F4F78"/>
-          <w:sz w:val="25"/>
+          <w:sz w:val="30"/>
         </w:rPr>
         <w:t>建议今天发送的材料</w:t>
       </w:r>
@@ -1424,7 +1527,7 @@
     <w:rPr>
       <w:rFonts w:ascii="PingFang SC" w:hAnsi="PingFang SC" w:eastAsia="PingFang SC"/>
       <w:b w:val="0"/>
-      <w:sz w:val="21"/>
+      <w:sz w:val="19"/>
     </w:rPr>
   </w:style>
   <w:style w:type="paragraph" w:styleId="ListBullet2">
@@ -1468,7 +1571,7 @@
     <w:rPr>
       <w:rFonts w:ascii="PingFang SC" w:hAnsi="PingFang SC" w:eastAsia="PingFang SC"/>
       <w:b w:val="0"/>
-      <w:sz w:val="20"/>
+      <w:sz w:val="19"/>
     </w:rPr>
   </w:style>
   <w:style w:type="paragraph" w:styleId="ListNumber2">

</xml_diff>

<commit_message>
Clarify dual network ports in contractor handoff
</commit_message>
<xml_diff>
--- a/exports/装修队强弱电必要确认_2026-07-07.docx
+++ b/exports/装修队强弱电必要确认_2026-07-07.docx
@@ -313,6 +313,20 @@
           <w:sz w:val="19"/>
         </w:rPr>
         <w:t>新增网络点、AP、PoE Zigbee、影音柜、书房、次卧/儿童房、主卧阳台：统一用 Cat6A 网线，不要求七类线。</w:t>
+      </w:r>
+    </w:p>
+    <w:p>
+      <w:pPr>
+        <w:pStyle w:val="ListBullet"/>
+        <w:spacing w:after="40"/>
+      </w:pPr>
+      <w:r>
+        <w:rPr>
+          <w:rFonts w:ascii="PingFang SC" w:hAnsi="PingFang SC" w:eastAsia="PingFang SC"/>
+          <w:b w:val="0"/>
+          <w:sz w:val="19"/>
+        </w:rPr>
+        <w:t>书房和次卧/儿童房的 2 个网口：按同一桌位、同一双口面板施工，2 根 Cat6A 分别直回衣帽间，避免后期桌下再加小交换机。</w:t>
       </w:r>
     </w:p>
     <w:p>

</xml_diff>